<commit_message>
Apelação Terezinha: ajustes de fundamentação (alterações destacadas em vermelho)
Co-Authored-By: Claude Opus 5.5 <noreply@anthropic.com>
Claude-Session: https://claude.ai/code/session_01GrvdmyTiymMGz8QVjzDfE5
</commit_message>
<xml_diff>
--- a/0800070-46.2025 - Terezinha da Costa Moreira/Apelação - Terezinha da Costa Moreira.docx
+++ b/0800070-46.2025 - Terezinha da Costa Moreira/Apelação - Terezinha da Costa Moreira.docx
@@ -532,7 +532,35 @@
           <w:b w:val="0"/>
           <w:i w:val="0"/>
         </w:rPr>
-        <w:t>O recurso é próprio (art. 1.009 do CPC) e tempestivo, pois o prazo foi interrompido pelos embargos de declaração do corréu (art. 1.026 do CPC) e reiniciado com a intimação da decisão que os rejeitou, cuja ciência foi registrada em 16/09/2026. É dispensado de preparo em razão da gratuidade de justiça. Há interesse recursal, uma vez que a sentença julgou improcedentes os pedidos de restituição dos valores descontados e de indenização por danos morais, acolheu apenas em parte o pedido de repactuação sem juros e distribuiu a sucumbência em desfavor da Apelante. Registre-se, ainda, que a Apelante ressalvou expressamente, nas contrarrazões aos embargos (ID 103737366), sua discordância com os capítulos desfavoráveis da sentença.</w:t>
+        <w:t>O recurso é próprio (art. 1.009 do CPC) e tempestivo, pois o prazo foi interrompido pelos embargos de declaração do corréu (art. 1.026 do CPC) e reiniciado com a intimação da decisão que os rejeitou, cuja ciência foi registrada em 16/09/2026. É dispensado de preparo em razão da gratuidade de justiça.</w:t>
+      </w:r>
+    </w:p>
+    <w:p>
+      <w:pPr>
+        <w:spacing w:after="60" w:line="360"/>
+        <w:ind w:firstLine="850"/>
+        <w:jc w:val="both"/>
+      </w:pPr>
+      <w:r>
+        <w:rPr>
+          <w:b w:val="0"/>
+          <w:i w:val="0"/>
+        </w:rPr>
+        <w:t>Há interesse recursal, uma vez que a sentença julgou improcedentes os pedidos de restituição dos valores descontados e de indenização por danos morais, acolheu apenas em parte o pedido de repactuação sem juros e distribuiu a sucumbência em desfavor da Apelante.</w:t>
+      </w:r>
+    </w:p>
+    <w:p>
+      <w:pPr>
+        <w:spacing w:after="60" w:line="360"/>
+        <w:ind w:firstLine="850"/>
+        <w:jc w:val="both"/>
+      </w:pPr>
+      <w:r>
+        <w:rPr>
+          <w:b w:val="0"/>
+          <w:i w:val="0"/>
+        </w:rPr>
+        <w:t>Registre-se, ainda, que a Apelante ressalvou expressamente, nas contrarrazões aos embargos (ID 103737366), sua discordância com os capítulos desfavoráveis da sentença.</w:t>
       </w:r>
     </w:p>
     <w:p>
@@ -567,7 +595,7 @@
           <w:b w:val="0"/>
           <w:i w:val="0"/>
         </w:rPr>
-        <w:t xml:space="preserve">A Apelante é professora da rede municipal de Miguel Alves desde 20/01/2005. Seus contracheques (ID 70383124) registram remuneração bruta de </w:t>
+        <w:t xml:space="preserve">A Apelante é professora da rede municipal de Miguel Alves desde 20/01/2005, seus contracheques (ID 70383124) registram remuneração bruta de </w:t>
       </w:r>
       <w:r>
         <w:rPr>
@@ -595,7 +623,21 @@
           <w:b w:val="0"/>
           <w:i w:val="0"/>
         </w:rPr>
-        <w:t xml:space="preserve">. O limite de 35%, adotado por esta Corte e pela sentença, corresponde, portanto, a </w:t>
+        <w:t>.</w:t>
+      </w:r>
+    </w:p>
+    <w:p>
+      <w:pPr>
+        <w:spacing w:after="60" w:line="360"/>
+        <w:ind w:firstLine="850"/>
+        <w:jc w:val="both"/>
+      </w:pPr>
+      <w:r>
+        <w:rPr>
+          <w:b w:val="0"/>
+          <w:i w:val="0"/>
+        </w:rPr>
+        <w:t xml:space="preserve">O limite de 35%, adotado por esta Corte e pela sentença, corresponde, portanto, a </w:t>
       </w:r>
       <w:r>
         <w:rPr>
@@ -731,21 +773,15 @@
           <w:b w:val="0"/>
           <w:i w:val="0"/>
         </w:rPr>
-        <w:t xml:space="preserve">, com vencimento final em 10/07/2034 (telas juntadas pelo próprio Bradesco no ID 87438679). Somente essa parcela correspondia a </w:t>
-      </w:r>
-      <w:r>
-        <w:rPr>
-          <w:b/>
-          <w:i w:val="0"/>
-        </w:rPr>
-        <w:t>42,08%</w:t>
-      </w:r>
-      <w:r>
-        <w:rPr>
-          <w:b w:val="0"/>
-          <w:i w:val="0"/>
-        </w:rPr>
-        <w:t xml:space="preserve"> da remuneração líquida, acima, portanto, do limite de 35%;</w:t>
+        <w:t xml:space="preserve">, com vencimento final em 10/07/2034 </w:t>
+      </w:r>
+      <w:r>
+        <w:rPr>
+          <w:b w:val="0"/>
+          <w:i w:val="0"/>
+          <w:color w:val="C00000"/>
+        </w:rPr>
+        <w:t>(telas juntadas pelo próprio Bradesco no ID 87438679);</w:t>
       </w:r>
     </w:p>
     <w:p>
@@ -761,6 +797,7 @@
         <w:rPr>
           <w:b w:val="0"/>
           <w:i w:val="0"/>
+          <w:color w:val="C00000"/>
         </w:rPr>
         <w:t>3.</w:t>
         <w:tab/>
@@ -770,6 +807,7 @@
         <w:rPr>
           <w:b/>
           <w:i w:val="0"/>
+          <w:color w:val="C00000"/>
         </w:rPr>
         <w:t>agosto de 2024</w:t>
       </w:r>
@@ -777,13 +815,15 @@
         <w:rPr>
           <w:b w:val="0"/>
           <w:i w:val="0"/>
-        </w:rPr>
-        <w:t xml:space="preserve">, com a margem já integralmente consumida pelo Bradesco, o Banco do Brasil refinanciou seus contratos em 120 parcelas, elevando seus descontos de R$ 609,65 para </w:t>
-      </w:r>
-      <w:r>
-        <w:rPr>
-          <w:b/>
-          <w:i w:val="0"/>
+          <w:color w:val="C00000"/>
+        </w:rPr>
+        <w:t xml:space="preserve">, o Banco do Brasil refinanciou seus contratos em 120 parcelas, elevando seus descontos de R$ 609,65 para </w:t>
+      </w:r>
+      <w:r>
+        <w:rPr>
+          <w:b/>
+          <w:i w:val="0"/>
+          <w:color w:val="C00000"/>
         </w:rPr>
         <w:t>R$ 4.357,23</w:t>
       </w:r>
@@ -791,22 +831,9 @@
         <w:rPr>
           <w:b w:val="0"/>
           <w:i w:val="0"/>
-        </w:rPr>
-        <w:t xml:space="preserve"> (R$ 2.169,47 + R$ 2.187,76), o que representa, isoladamente, </w:t>
-      </w:r>
-      <w:r>
-        <w:rPr>
-          <w:b/>
-          <w:i w:val="0"/>
-        </w:rPr>
-        <w:t>48,49%</w:t>
-      </w:r>
-      <w:r>
-        <w:rPr>
-          <w:b w:val="0"/>
-          <w:i w:val="0"/>
-        </w:rPr>
-        <w:t xml:space="preserve"> da remuneração líquida;</w:t>
+          <w:color w:val="C00000"/>
+        </w:rPr>
+        <w:t xml:space="preserve"> (R$ 2.169,47 + R$ 2.187,76);</w:t>
       </w:r>
     </w:p>
     <w:p>
@@ -822,6 +849,7 @@
         <w:rPr>
           <w:b w:val="0"/>
           <w:i w:val="0"/>
+          <w:color w:val="C00000"/>
         </w:rPr>
         <w:t>4.</w:t>
         <w:tab/>
@@ -831,6 +859,7 @@
         <w:rPr>
           <w:b/>
           <w:i w:val="0"/>
+          <w:color w:val="C00000"/>
         </w:rPr>
         <w:t>R$ 8.137,92</w:t>
       </w:r>
@@ -838,27 +867,15 @@
         <w:rPr>
           <w:b w:val="0"/>
           <w:i w:val="0"/>
-        </w:rPr>
-        <w:t xml:space="preserve"> mensais, isto é, </w:t>
-      </w:r>
-      <w:r>
-        <w:rPr>
-          <w:b/>
-          <w:i w:val="0"/>
-        </w:rPr>
-        <w:t>90,57%</w:t>
-      </w:r>
-      <w:r>
-        <w:rPr>
-          <w:b w:val="0"/>
-          <w:i w:val="0"/>
-        </w:rPr>
-        <w:t xml:space="preserve"> da remuneração líquida, e a Apelante passou a receber </w:t>
-      </w:r>
-      <w:r>
-        <w:rPr>
-          <w:b/>
-          <w:i w:val="0"/>
+          <w:color w:val="C00000"/>
+        </w:rPr>
+        <w:t xml:space="preserve"> mensais, e a Apelante passou a receber </w:t>
+      </w:r>
+      <w:r>
+        <w:rPr>
+          <w:b/>
+          <w:i w:val="0"/>
+          <w:color w:val="C00000"/>
         </w:rPr>
         <w:t>R$ 1,42 (um real e quarenta e dois centavos)</w:t>
       </w:r>
@@ -866,6 +883,7 @@
         <w:rPr>
           <w:b w:val="0"/>
           <w:i w:val="0"/>
+          <w:color w:val="C00000"/>
         </w:rPr>
         <w:t xml:space="preserve"> por mês.</w:t>
       </w:r>
@@ -881,7 +899,7 @@
           <w:b w:val="0"/>
           <w:i w:val="0"/>
         </w:rPr>
-        <w:t>Por decisão do Exmo. Relator do Agravo de Instrumento nº 0757054-31.2025.8.18.0000, confirmada pelo colegiado (ID 28625474), esta Corte limitou os descontos a 35% da remuneração líquida, reconhecendo que os contracheques constituíam “prova documental robusta e coerente com os fatos narrados” e que a retenção integral dos vencimentos colocava a Apelante “em estado de vulnerabilidade social extrema”. A restituição foi indeferida apenas “por ora”, para ser “analisada em cognição exauriente na ação principal”.</w:t>
+        <w:t>Por decisão do Exmo. Relator do Agravo de Instrumento nº 0757054-31.2025.8.18.0000, confirmada pelo colegiado (ID 28625474), esta Corte limitou os descontos a 35% da remuneração líquida, reconhecendo que os contracheques constituíam “prova documental robusta e coerente com os fatos narrados” e que a retenção integral dos vencimentos colocava a Apelante “em estado de vulnerabilidade social extrema”.</w:t>
       </w:r>
     </w:p>
     <w:p>
@@ -909,7 +927,21 @@
           <w:b w:val="0"/>
           <w:i w:val="0"/>
         </w:rPr>
-        <w:t xml:space="preserve">A r. sentença (ID 93153901) reconheceu a relação de consumo, o superendividamento, a violação ao mínimo existencial e a falha no dever de cuidado das instituições financeiras. Confirmou a limitação dos descontos a 35%, de forma solidária, e determinou que o saldo remanescente seja pago ao final dos contratos, sem juros de mora. Contudo, julgou improcedentes os pedidos de </w:t>
+        <w:t>A r. sentença (ID 93153901) reconheceu a relação de consumo, o superendividamento, a violação ao mínimo existencial e a falha no dever de cuidado das instituições financeiras. Confirmou a limitação dos descontos a 35%, de forma solidária, e determinou que o saldo remanescente seja pago ao final dos contratos, sem juros de mora.</w:t>
+      </w:r>
+    </w:p>
+    <w:p>
+      <w:pPr>
+        <w:spacing w:after="60" w:line="360"/>
+        <w:ind w:firstLine="850"/>
+        <w:jc w:val="both"/>
+      </w:pPr>
+      <w:r>
+        <w:rPr>
+          <w:b w:val="0"/>
+          <w:i w:val="0"/>
+        </w:rPr>
+        <w:t xml:space="preserve">Contudo, julgou improcedentes os pedidos de </w:t>
       </w:r>
       <w:r>
         <w:rPr>
@@ -1023,7 +1055,7 @@
         <w:rPr>
           <w:b w:val="0"/>
           <w:bCs/>
-          <w:i/>
+          <w:i w:val="0"/>
           <w:iCs/>
           <w:sz w:val="18"/>
           <w:szCs w:val="18"/>
@@ -1044,7 +1076,7 @@
         <w:rPr>
           <w:b w:val="0"/>
           <w:bCs/>
-          <w:i/>
+          <w:i w:val="0"/>
           <w:iCs/>
           <w:sz w:val="18"/>
           <w:szCs w:val="18"/>
@@ -1065,12 +1097,35 @@
         <w:rPr>
           <w:b w:val="0"/>
           <w:bCs/>
-          <w:i/>
+          <w:i w:val="0"/>
           <w:iCs/>
           <w:sz w:val="18"/>
           <w:szCs w:val="18"/>
         </w:rPr>
-        <w:t>“[...] a impossibilidade de pagamento integral das parcelas originais não pode ser imputada à autora, mas sim à conduta das próprias instituições financeiras que permitiram o superendividamento.”</w:t>
+        <w:t>“</w:t>
+      </w:r>
+      <w:r>
+        <w:rPr>
+          <w:b/>
+          <w:bCs/>
+          <w:i w:val="0"/>
+          <w:iCs/>
+          <w:sz w:val="18"/>
+          <w:szCs w:val="18"/>
+          <w:highlight w:val="yellow"/>
+        </w:rPr>
+        <w:t>[...]</w:t>
+      </w:r>
+      <w:r>
+        <w:rPr>
+          <w:b w:val="0"/>
+          <w:bCs/>
+          <w:i w:val="0"/>
+          <w:iCs/>
+          <w:sz w:val="18"/>
+          <w:szCs w:val="18"/>
+        </w:rPr>
+        <w:t xml:space="preserve"> a impossibilidade de pagamento integral das parcelas originais não pode ser imputada à autora, mas sim à conduta das próprias instituições financeiras que permitiram o superendividamento.”</w:t>
       </w:r>
     </w:p>
     <w:p>
@@ -1099,21 +1154,64 @@
           <w:b w:val="0"/>
           <w:i w:val="0"/>
         </w:rPr>
-        <w:t xml:space="preserve"> do descontrole financeiro da própria consumidora”. As duas conclusões são inconciliáveis. Se a falha no dever de cuidado é dos bancos, se a impossibilidade de pagamento é imputável à conduta deles e se os descontos submeteram a consumidora a condição indigna, há conduta ilícita, dano e nexo causal, e a consequência jurídica é a reparação integral (arts. 6º, VI, e 14 do CDC).</w:t>
-      </w:r>
-    </w:p>
-    <w:p>
-      <w:pPr>
-        <w:spacing w:after="60" w:line="360"/>
-        <w:ind w:firstLine="850"/>
-        <w:jc w:val="both"/>
-      </w:pPr>
-      <w:r>
-        <w:rPr>
-          <w:b w:val="0"/>
-          <w:i w:val="0"/>
-        </w:rPr>
-        <w:t>O próprio Código de Defesa do Consumidor, no dispositivo que a sentença invocou, estabelece essa consequência. O parágrafo único do art. 54-D dispõe que o descumprimento dos deveres de crédito responsável pode acarretar a redução dos juros e encargos e a dilação do prazo de pagamento, “sem prejuízo de outras sanções e de indenização por perdas e danos, patrimoniais e morais, ao consumidor”. A sentença aplicou a primeira parte da norma (repactuação) e deixou de aplicar a segunda (indenização), sem justificativa.</w:t>
+        <w:t xml:space="preserve"> do descontrole financeiro da própria consumidora”.</w:t>
+      </w:r>
+    </w:p>
+    <w:p>
+      <w:pPr>
+        <w:spacing w:after="60" w:line="360"/>
+        <w:ind w:firstLine="850"/>
+        <w:jc w:val="both"/>
+      </w:pPr>
+      <w:r>
+        <w:rPr>
+          <w:b w:val="0"/>
+          <w:i w:val="0"/>
+          <w:color w:val="C00000"/>
+        </w:rPr>
+        <w:t>A sentença, contudo, deixou de extrair as consequências de suas próprias premissas. Para afastar os juros de mora sobre o saldo remanescente, afirmou que a impossibilidade de pagamento “não pode ser imputada à autora, mas sim à conduta das próprias instituições financeiras”. Para negar os danos morais, atribuiu a mesma situação ao “descontrole financeiro da própria consumidora”. Um mesmo fato não pode ser imputado aos bancos para um fim e à consumidora para outro. Reconhecidas a falha no dever de cuidado e a responsabilidade das instituições financeiras pelo superendividamento, há defeito na prestação do serviço, dano e nexo causal, e a consequência jurídica é a reparação (arts. 6º, VI, e 14 do CDC).</w:t>
+      </w:r>
+    </w:p>
+    <w:p>
+      <w:pPr>
+        <w:spacing w:after="60" w:line="360"/>
+        <w:ind w:firstLine="850"/>
+        <w:jc w:val="both"/>
+      </w:pPr>
+      <w:r>
+        <w:rPr>
+          <w:b w:val="0"/>
+          <w:i w:val="0"/>
+        </w:rPr>
+        <w:t>O próprio Código de Defesa do Consumidor, no dispositivo que a sentença invocou, estabelece essa consequência.</w:t>
+      </w:r>
+    </w:p>
+    <w:p>
+      <w:pPr>
+        <w:spacing w:after="60" w:line="360"/>
+        <w:ind w:firstLine="850"/>
+        <w:jc w:val="both"/>
+      </w:pPr>
+      <w:r>
+        <w:rPr>
+          <w:b w:val="0"/>
+          <w:i w:val="0"/>
+        </w:rPr>
+        <w:t>O parágrafo único do art. 54-D dispõe que o descumprimento dos deveres de crédito responsável pode acarretar a redução dos juros e encargos e a dilação do prazo de pagamento, “sem prejuízo de outras sanções e de indenização por perdas e danos, patrimoniais e morais, ao consumidor”.</w:t>
+      </w:r>
+    </w:p>
+    <w:p>
+      <w:pPr>
+        <w:spacing w:after="60" w:line="360"/>
+        <w:ind w:firstLine="850"/>
+        <w:jc w:val="both"/>
+      </w:pPr>
+      <w:r>
+        <w:rPr>
+          <w:b w:val="0"/>
+          <w:i w:val="0"/>
+        </w:rPr>
+        <w:t>A sentença aplicou a primeira parte da norma (repactuação) e deixou de aplicar a segunda (indenização), sem justificativa.</w:t>
       </w:r>
     </w:p>
     <w:p>
@@ -1131,160 +1229,56 @@
           <w:bCs/>
           <w:i/>
           <w:iCs/>
+          <w:color w:val="C00000"/>
         </w:rPr>
         <w:t>b.</w:t>
         <w:tab/>
-        <w:t>Os contratos não observaram a margem consignável nem mesmo na origem:</w:t>
-      </w:r>
-    </w:p>
-    <w:p>
-      <w:pPr>
-        <w:spacing w:after="60" w:line="360"/>
-        <w:ind w:firstLine="850"/>
-        <w:jc w:val="both"/>
-      </w:pPr>
-      <w:r>
-        <w:rPr>
-          <w:b w:val="0"/>
-          <w:i w:val="0"/>
-        </w:rPr>
-        <w:t>A premissa de que os contratos eram “válidos na origem” não se sustenta diante dos documentos dos autos. Pelo próprio critério defendido pelo Banco do Brasil na contestação (“vencimento bruto – INSS – IRRF = vencimento líquido”), a margem de 35% era de R$ 3.144,78. Os números demonstram que:</w:t>
-      </w:r>
-    </w:p>
-    <w:p>
-      <w:pPr>
-        <w:tabs>
-          <w:tab w:val="left" w:pos="1000"/>
-        </w:tabs>
-        <w:spacing w:after="60" w:line="360"/>
-        <w:ind w:left="1000" w:hanging="400"/>
-        <w:jc w:val="both"/>
-      </w:pPr>
-      <w:r>
-        <w:rPr>
-          <w:b w:val="0"/>
-          <w:i w:val="0"/>
-        </w:rPr>
-        <w:t>1.</w:t>
-        <w:tab/>
-        <w:t xml:space="preserve">o </w:t>
-      </w:r>
-      <w:r>
-        <w:rPr>
-          <w:b/>
-          <w:i w:val="0"/>
-        </w:rPr>
-        <w:t>Bradesco</w:t>
-      </w:r>
-      <w:r>
-        <w:rPr>
-          <w:b w:val="0"/>
-          <w:i w:val="0"/>
-        </w:rPr>
-        <w:t xml:space="preserve"> contratou, em 12/06/2024, empréstimo de R$ 197.016,12 em 120 parcelas de R$ 3.780,69, valor que, </w:t>
-      </w:r>
-      <w:r>
-        <w:rPr>
-          <w:b/>
-          <w:i w:val="0"/>
-        </w:rPr>
-        <w:t>sozinho</w:t>
-      </w:r>
-      <w:r>
-        <w:rPr>
-          <w:b w:val="0"/>
-          <w:i w:val="0"/>
-        </w:rPr>
-        <w:t>, já superava a margem em R$ 635,91 por mês (42,08% da remuneração líquida);</w:t>
-      </w:r>
-    </w:p>
-    <w:p>
-      <w:pPr>
-        <w:tabs>
-          <w:tab w:val="left" w:pos="1000"/>
-        </w:tabs>
-        <w:spacing w:after="60" w:line="360"/>
-        <w:ind w:left="1000" w:hanging="400"/>
-        <w:jc w:val="both"/>
-      </w:pPr>
-      <w:r>
-        <w:rPr>
-          <w:b w:val="0"/>
-          <w:i w:val="0"/>
-        </w:rPr>
-        <w:t>2.</w:t>
-        <w:tab/>
-        <w:t xml:space="preserve">o </w:t>
-      </w:r>
-      <w:r>
-        <w:rPr>
-          <w:b/>
-          <w:i w:val="0"/>
-        </w:rPr>
-        <w:t>Banco do Brasil</w:t>
-      </w:r>
-      <w:r>
-        <w:rPr>
-          <w:b w:val="0"/>
-          <w:i w:val="0"/>
-        </w:rPr>
-        <w:t xml:space="preserve"> refinanciou seus contratos em agosto de 2024, quando a margem estava </w:t>
-      </w:r>
-      <w:r>
-        <w:rPr>
-          <w:b/>
-          <w:i w:val="0"/>
-        </w:rPr>
-        <w:t>inteiramente esgotada</w:t>
-      </w:r>
-      <w:r>
-        <w:rPr>
-          <w:b w:val="0"/>
-          <w:i w:val="0"/>
-        </w:rPr>
-        <w:t xml:space="preserve"> pelo contrato do Bradesco. Não havia, naquele momento, nenhum centavo de margem disponível, de modo que </w:t>
-      </w:r>
-      <w:r>
-        <w:rPr>
-          <w:b/>
-          <w:i w:val="0"/>
-        </w:rPr>
-        <w:t>a totalidade</w:t>
-      </w:r>
-      <w:r>
-        <w:rPr>
-          <w:b w:val="0"/>
-          <w:i w:val="0"/>
-        </w:rPr>
-        <w:t xml:space="preserve"> das novas parcelas do Banco do Brasil (R$ 4.357,23) foi averbada fora do limite. Ainda que considerado isoladamente, o desconto do Banco do Brasil correspondia a 48,49% da remuneração líquida.</w:t>
-      </w:r>
-    </w:p>
-    <w:p>
-      <w:pPr>
-        <w:spacing w:after="60" w:line="360"/>
-        <w:ind w:firstLine="850"/>
-        <w:jc w:val="both"/>
-      </w:pPr>
-      <w:r>
-        <w:rPr>
-          <w:b w:val="0"/>
-          <w:i w:val="0"/>
-        </w:rPr>
-        <w:t>Os bancos afirmaram, nas contestações, que a margem teria sido “liberada” pela Prefeitura de Miguel Alves. Nenhum deles, porém, juntou a consulta, a autorização ou o comprovante de averbação, embora tais documentos estejam exclusivamente em seu poder. Ao contrário, ambos requereram o julgamento antecipado da lide, declarando que a prova documental era suficiente (ID 89257619). A alegação de liberação da margem constitui fato impeditivo do direito da autora, cujo ônus é do réu (art. 373, II, do CPC), além de ter sido requerida a inversão do ônus da prova (art. 6º, VIII, do CDC). Não demonstrada, prevalece o que os contracheques revelam: os descontos ultrapassaram o limite desde o início.</w:t>
-      </w:r>
-    </w:p>
-    <w:p>
-      <w:pPr>
-        <w:spacing w:after="60" w:line="360"/>
-        <w:ind w:firstLine="850"/>
-        <w:jc w:val="both"/>
-      </w:pPr>
-      <w:r>
-        <w:rPr>
-          <w:b w:val="0"/>
-          <w:i w:val="0"/>
-        </w:rPr>
-        <w:t>Ressalte-se que a margem consignável não é um parâmetro criado pela sentença. Trata-se de limite legal, aplicado por analogia por esta Corte e pela sentença, que deveria ter sido observado no momento da concessão do crédito, como expressão do dever de avaliar a capacidade de pagamento do consumidor (arts. 6º, XI, e 54-D, II, do CDC). A decisão judicial que o reconhece tem natureza declaratória: o desconto excedente era indevido desde o primeiro mês, e não apenas a partir da tutela.</w:t>
+        <w:t>A averbação pela fonte pagadora não afasta o dever próprio das instituições financeiras:</w:t>
+      </w:r>
+    </w:p>
+    <w:p>
+      <w:pPr>
+        <w:spacing w:after="60" w:line="360"/>
+        <w:ind w:firstLine="850"/>
+        <w:jc w:val="both"/>
+      </w:pPr>
+      <w:r>
+        <w:rPr>
+          <w:b w:val="0"/>
+          <w:i w:val="0"/>
+          <w:color w:val="C00000"/>
+        </w:rPr>
+        <w:t>A sentença afirmou que os contratos eram “válidos na origem”, apoiando-se na regularidade formal das contratações e na averbação pela fonte pagadora. A Apelante não discute a existência formal dos contratos nem a averbação realizada pela Prefeitura. Discute o descumprimento de dever que é próprio e intransferível da instituição financeira.</w:t>
+      </w:r>
+    </w:p>
+    <w:p>
+      <w:pPr>
+        <w:spacing w:after="60" w:line="360"/>
+        <w:ind w:firstLine="850"/>
+        <w:jc w:val="both"/>
+      </w:pPr>
+      <w:r>
+        <w:rPr>
+          <w:b w:val="0"/>
+          <w:i w:val="0"/>
+          <w:color w:val="C00000"/>
+        </w:rPr>
+        <w:t>A averbação atesta apenas a disponibilidade de margem na folha de pagamento, segundo os registros do órgão pagador. Não substitui a obrigação do fornecedor de avaliar, de forma responsável, as condições de crédito do consumidor (art. 54-D, II, do CDC), nem o dever de prevenção do superendividamento (art. 6º, XI, do CDC). A própria sentença reconheceu que “a concessão sucessiva de crédito, sem uma avaliação criteriosa e global da capacidade de pagamento da consumidora, revela uma falha no dever de cuidado por parte das instituições financeiras”.</w:t>
+      </w:r>
+    </w:p>
+    <w:p>
+      <w:pPr>
+        <w:spacing w:after="60" w:line="360"/>
+        <w:ind w:firstLine="850"/>
+        <w:jc w:val="both"/>
+      </w:pPr>
+      <w:r>
+        <w:rPr>
+          <w:b w:val="0"/>
+          <w:i w:val="0"/>
+          <w:color w:val="C00000"/>
+        </w:rPr>
+        <w:t>O resultado dessa falha está documentado e é incontroverso: em agosto de 2024, a Apelante, servidora com mais de dezenove anos de serviço público, passou a receber R$ 1,42 por mês. Nenhuma avaliação minimamente responsável da capacidade de pagamento permitiria tal resultado. É esse descumprimento, e não a validade formal do contrato, que fundamenta a reparação.</w:t>
       </w:r>
     </w:p>
     <w:p>
@@ -1347,7 +1341,22 @@
           <w:b w:val="0"/>
           <w:i w:val="0"/>
         </w:rPr>
-        <w:t>, exatamente o mesmo limite que a sentença reconheceu como necessário à preservação do mínimo existencial. Se o desconto acima de 35% é incompatível com a dignidade da consumidora a partir da sentença, também o era nos meses em que a Apelante sobreviveu com R$ 1,42. Limitar a proteção ao futuro significa deixar sem reparação justamente o período de maior violação, que a própria sentença qualificou como “condição indigna”.</w:t>
+        <w:t>, exatamente o mesmo limite que a sentença reconheceu como necessário à preservação do mínimo existencial.</w:t>
+      </w:r>
+    </w:p>
+    <w:p>
+      <w:pPr>
+        <w:spacing w:after="60" w:line="360"/>
+        <w:ind w:firstLine="850"/>
+        <w:jc w:val="both"/>
+      </w:pPr>
+      <w:r>
+        <w:rPr>
+          <w:b w:val="0"/>
+          <w:i w:val="0"/>
+          <w:color w:val="C00000"/>
+        </w:rPr>
+        <w:t>O fundamento da restituição não é a invalidade dos contratos, que permanecem hígidos, mas a cobrança acima do limite reconhecido como necessário à subsistência da consumidora, decorrente do descumprimento do dever de crédito responsável (art. 54-D, parágrafo único, do CDC). A restituição, portanto, não interfere na limitação fixada nem na validade das contratações.</w:t>
       </w:r>
     </w:p>
     <w:p>
@@ -1375,7 +1384,49 @@
           <w:b w:val="0"/>
           <w:i w:val="0"/>
         </w:rPr>
-        <w:t>. A própria sentença criou o mecanismo que afasta essa preocupação: o saldo devedor resultante da limitação será apurado em liquidação e pago ao final dos contratos. Os valores descontados em excesso, uma vez restituídos, simplesmente passam a integrar esse saldo remanescente, a ser pago pela autora nas mesmas condições. Os bancos receberão a integralidade de seus créditos; altera-se apenas o momento do pagamento, que é exatamente a solução adotada pela sentença para as parcelas vincendas. Enriquecimento sem causa há, na verdade, na situação inversa: as instituições financeiras retêm, como fruto da conduta que a sentença reputou abusiva, valores que deveriam ter permanecido à disposição da consumidora para sua subsistência.</w:t>
+        <w:t>. A própria sentença criou o mecanismo que afasta essa preocupação: o saldo devedor resultante da limitação será apurado em liquidação e pago ao final dos contratos.</w:t>
+      </w:r>
+    </w:p>
+    <w:p>
+      <w:pPr>
+        <w:spacing w:after="60" w:line="360"/>
+        <w:ind w:firstLine="850"/>
+        <w:jc w:val="both"/>
+      </w:pPr>
+      <w:r>
+        <w:rPr>
+          <w:b w:val="0"/>
+          <w:i w:val="0"/>
+        </w:rPr>
+        <w:t>Os valores descontados em excesso, uma vez restituídos, simplesmente passam a integrar esse saldo remanescente, a ser pago pela autora nas mesmas condições.</w:t>
+      </w:r>
+    </w:p>
+    <w:p>
+      <w:pPr>
+        <w:spacing w:after="60" w:line="360"/>
+        <w:ind w:firstLine="850"/>
+        <w:jc w:val="both"/>
+      </w:pPr>
+      <w:r>
+        <w:rPr>
+          <w:b w:val="0"/>
+          <w:i w:val="0"/>
+        </w:rPr>
+        <w:t>Os bancos receberão a integralidade de seus créditos; altera-se apenas o momento do pagamento, que é exatamente a solução adotada pela sentença para as parcelas vincendas.</w:t>
+      </w:r>
+    </w:p>
+    <w:p>
+      <w:pPr>
+        <w:spacing w:after="60" w:line="360"/>
+        <w:ind w:firstLine="850"/>
+        <w:jc w:val="both"/>
+      </w:pPr>
+      <w:r>
+        <w:rPr>
+          <w:b w:val="0"/>
+          <w:i w:val="0"/>
+        </w:rPr>
+        <w:t>Enriquecimento sem causa há, na verdade, na situação inversa: as instituições financeiras retêm, como fruto da conduta que a sentença reputou abusiva, valores que deveriam ter permanecido à disposição da consumidora para sua subsistência.</w:t>
       </w:r>
     </w:p>
     <w:p>
@@ -1416,200 +1467,46 @@
         <w:rPr>
           <w:b w:val="0"/>
           <w:i w:val="0"/>
-        </w:rPr>
-        <w:t xml:space="preserve">O cálculo do excesso é simples e decorre dos contracheques. No período de agosto de 2024 a fevereiro de 2025, indicado na inicial, os descontos somados (R$ 8.137,92) superaram o limite (R$ 3.144,78) em </w:t>
-      </w:r>
-      <w:r>
-        <w:rPr>
-          <w:b/>
-          <w:i w:val="0"/>
-        </w:rPr>
-        <w:t>R$ 4.993,14 por mês</w:t>
-      </w:r>
-      <w:r>
-        <w:rPr>
-          <w:b w:val="0"/>
-          <w:i w:val="0"/>
-        </w:rPr>
-        <w:t xml:space="preserve">, totalizando </w:t>
-      </w:r>
-      <w:r>
-        <w:rPr>
-          <w:b/>
-          <w:i w:val="0"/>
-        </w:rPr>
-        <w:t>R$ 34.951,98</w:t>
-      </w:r>
-      <w:r>
-        <w:rPr>
-          <w:b w:val="0"/>
-          <w:i w:val="0"/>
-        </w:rPr>
-        <w:t>. A distribuição entre os réus pode observar:</w:t>
-      </w:r>
-    </w:p>
-    <w:p>
-      <w:pPr>
-        <w:tabs>
-          <w:tab w:val="left" w:pos="1000"/>
-        </w:tabs>
-        <w:spacing w:after="60" w:line="360"/>
-        <w:ind w:left="1000" w:hanging="400"/>
-        <w:jc w:val="both"/>
-      </w:pPr>
-      <w:r>
-        <w:rPr>
-          <w:b w:val="0"/>
-          <w:i w:val="0"/>
-        </w:rPr>
-        <w:t>1.</w:t>
-        <w:tab/>
-        <w:t xml:space="preserve">o </w:t>
-      </w:r>
-      <w:r>
-        <w:rPr>
-          <w:b/>
-          <w:i w:val="0"/>
-        </w:rPr>
-        <w:t>critério cronológico</w:t>
-      </w:r>
-      <w:r>
-        <w:rPr>
-          <w:b w:val="0"/>
-          <w:i w:val="0"/>
-        </w:rPr>
-        <w:t xml:space="preserve">, que reflete a ordem das contratações: como o Banco do Brasil refinanciou quando a margem já estava esgotada, todo o seu desconto excedeu o limite (R$ 4.357,23 × 7 = </w:t>
-      </w:r>
-      <w:r>
-        <w:rPr>
-          <w:b/>
-          <w:i w:val="0"/>
-        </w:rPr>
-        <w:t>R$ 30.500,61</w:t>
-      </w:r>
-      <w:r>
-        <w:rPr>
-          <w:b w:val="0"/>
-          <w:i w:val="0"/>
-        </w:rPr>
-        <w:t xml:space="preserve">, exatamente o valor indicado na inicial), cabendo ao Bradesco o excedente de sua própria parcela (R$ 635,91 × 7 = </w:t>
-      </w:r>
-      <w:r>
-        <w:rPr>
-          <w:b/>
-          <w:i w:val="0"/>
-        </w:rPr>
-        <w:t>R$ 4.451,37</w:t>
-      </w:r>
-      <w:r>
-        <w:rPr>
-          <w:b w:val="0"/>
-          <w:i w:val="0"/>
-        </w:rPr>
-        <w:t>); ou</w:t>
-      </w:r>
-    </w:p>
-    <w:p>
-      <w:pPr>
-        <w:tabs>
-          <w:tab w:val="left" w:pos="1000"/>
-        </w:tabs>
-        <w:spacing w:after="60" w:line="360"/>
-        <w:ind w:left="1000" w:hanging="400"/>
-        <w:jc w:val="both"/>
-      </w:pPr>
-      <w:r>
-        <w:rPr>
-          <w:b w:val="0"/>
-          <w:i w:val="0"/>
-        </w:rPr>
-        <w:t>2.</w:t>
-        <w:tab/>
-        <w:t xml:space="preserve">o </w:t>
-      </w:r>
-      <w:r>
-        <w:rPr>
-          <w:b/>
-          <w:i w:val="0"/>
-        </w:rPr>
-        <w:t>critério proporcional</w:t>
-      </w:r>
-      <w:r>
-        <w:rPr>
-          <w:b w:val="0"/>
-          <w:i w:val="0"/>
-        </w:rPr>
-        <w:t xml:space="preserve">, adotado pela sentença para a limitação: Banco do Brasil, </w:t>
-      </w:r>
-      <w:r>
-        <w:rPr>
-          <w:b/>
-          <w:i w:val="0"/>
-        </w:rPr>
-        <w:t>R$ 18.714,10</w:t>
-      </w:r>
-      <w:r>
-        <w:rPr>
-          <w:b w:val="0"/>
-          <w:i w:val="0"/>
-        </w:rPr>
-        <w:t xml:space="preserve">; Bradesco, </w:t>
-      </w:r>
-      <w:r>
-        <w:rPr>
-          <w:b/>
-          <w:i w:val="0"/>
-        </w:rPr>
-        <w:t>R$ 16.237,89</w:t>
-      </w:r>
-      <w:r>
-        <w:rPr>
-          <w:b w:val="0"/>
-          <w:i w:val="0"/>
-        </w:rPr>
-        <w:t>.</w:t>
-      </w:r>
-    </w:p>
-    <w:p>
-      <w:pPr>
-        <w:spacing w:after="60" w:line="360"/>
-        <w:ind w:firstLine="850"/>
-        <w:jc w:val="both"/>
-      </w:pPr>
-      <w:r>
-        <w:rPr>
-          <w:b w:val="0"/>
-          <w:i w:val="0"/>
-        </w:rPr>
-        <w:t>A esse montante devem ser acrescidos os valores descontados em excesso após fevereiro de 2025, em folha ou em conta corrente, até a efetiva adequação por cada instituição, a serem apurados em liquidação de sentença (art. 509 do CPC), com correção monetária desde cada desconto (Súmula 43 do STJ) e juros de mora desde a citação. Considerando que a sentença já reconheceu a responsabilidade solidária dos réus pela observância do limite, e que ambos concorreram para o dano (arts. 7º, parágrafo único, e 25, § 1º, do CDC), a condenação deve ser solidária.</w:t>
-      </w:r>
-    </w:p>
-    <w:p>
-      <w:pPr>
-        <w:spacing w:after="60" w:line="360"/>
-        <w:ind w:firstLine="850"/>
-        <w:jc w:val="both"/>
-      </w:pPr>
-      <w:r>
-        <w:rPr>
-          <w:b w:val="0"/>
-          <w:i w:val="0"/>
-        </w:rPr>
-        <w:t xml:space="preserve">Subsidiariamente, caso esta Colenda Câmara entenda inadequada a restituição em dinheiro, requer-se que os valores descontados em excesso sejam </w:t>
-      </w:r>
-      <w:r>
-        <w:rPr>
-          <w:b/>
-          <w:i w:val="0"/>
-        </w:rPr>
-        <w:t>abatidos do saldo devedor</w:t>
-      </w:r>
-      <w:r>
-        <w:rPr>
-          <w:b w:val="0"/>
-          <w:i w:val="0"/>
-        </w:rPr>
-        <w:t xml:space="preserve"> de cada contrato, com a consequente redução do saldo remanescente a ser pago ao final, solução que preserva o crédito dos bancos e, ao mesmo tempo, impede que o excesso reconhecido fique sem qualquer reparação.</w:t>
+          <w:color w:val="C00000"/>
+        </w:rPr>
+        <w:t>Os valores descontados acima do limite de 35%, desde agosto de 2024 até a efetiva adequação dos descontos por cada instituição, em folha ou em conta corrente, deverão ser apurados em liquidação de sentença (art. 509 do CPC), com correção monetária desde cada desconto (Súmula 43 do STJ) e juros de mora desde a citação.</w:t>
+      </w:r>
+      <w:r>
+        <w:rPr>
+          <w:b w:val="0"/>
+          <w:i w:val="0"/>
+        </w:rPr>
+        <w:t xml:space="preserve"> Considerando que a sentença já reconheceu a responsabilidade solidária dos réus pela observância do limite, e que ambos concorreram para o dano (arts. 7º, parágrafo único, e 25, § 1º, do CDC), a condenação deve ser solidária.</w:t>
+      </w:r>
+    </w:p>
+    <w:p>
+      <w:pPr>
+        <w:spacing w:after="60" w:line="360"/>
+        <w:ind w:firstLine="850"/>
+        <w:jc w:val="both"/>
+      </w:pPr>
+      <w:r>
+        <w:rPr>
+          <w:b w:val="0"/>
+          <w:i w:val="0"/>
+          <w:color w:val="C00000"/>
+        </w:rPr>
+        <w:t>Ainda que esta Colenda Câmara entenda que a limitação deva produzir efeitos apenas a partir da tutela de urgência, impõe-se, ao menos, a restituição dos valores descontados acima de 35% após a decisão proferida em 02/06/2025 no Agravo de Instrumento nº 0757054-31.2025.8.18.0000. A partir dessa data, os descontos excedentes passaram a contrariar ordem judicial expressa, sendo indevidos independentemente de qualquer discussão sobre a regularidade das contratações.</w:t>
+      </w:r>
+    </w:p>
+    <w:p>
+      <w:pPr>
+        <w:spacing w:after="60" w:line="360"/>
+        <w:ind w:firstLine="850"/>
+        <w:jc w:val="both"/>
+      </w:pPr>
+      <w:r>
+        <w:rPr>
+          <w:b w:val="0"/>
+          <w:i w:val="0"/>
+          <w:color w:val="C00000"/>
+        </w:rPr>
+        <w:t>Subsidiariamente, caso se entenda inadequada a restituição em dinheiro, requer-se que os valores descontados em excesso sejam abatidos do saldo devedor de cada contrato, com a redução correspondente do saldo remanescente, solução que preserva integralmente o crédito dos bancos e impede que o excesso reconhecido fique sem reparação.</w:t>
       </w:r>
     </w:p>
     <w:p>
@@ -1672,36 +1569,58 @@
         <w:rPr>
           <w:b w:val="0"/>
           <w:i w:val="0"/>
-        </w:rPr>
-        <w:t xml:space="preserve">A Apelante teve </w:t>
-      </w:r>
-      <w:r>
-        <w:rPr>
-          <w:b/>
-          <w:i w:val="0"/>
-        </w:rPr>
-        <w:t>99,98% de sua remuneração líquida absorvida pelos descontos</w:t>
-      </w:r>
-      <w:r>
-        <w:rPr>
-          <w:b w:val="0"/>
-          <w:i w:val="0"/>
-        </w:rPr>
-        <w:t xml:space="preserve"> durante meses, recebendo R$ 1,42 por mês, situação que esta Corte classificou como “vulnerabilidade social extrema” e que a própria sentença qualificou como “condição indigna”. O salário tem natureza alimentar e proteção constitucional (art. 7º, X, da CF) e processual (art. 833, IV, do CPC). A privação dos meios de subsistência de uma pessoa, imposta por falha na concessão do crédito, ultrapassa em muito o aborrecimento cotidiano e atinge diretamente a dignidade da pessoa humana (art. 1º, III, da CF).</w:t>
-      </w:r>
-    </w:p>
-    <w:p>
-      <w:pPr>
-        <w:spacing w:after="60" w:line="360"/>
-        <w:ind w:firstLine="850"/>
-        <w:jc w:val="both"/>
-      </w:pPr>
-      <w:r>
-        <w:rPr>
-          <w:b w:val="0"/>
-          <w:i w:val="0"/>
-        </w:rPr>
-        <w:t>Como demonstrado, a sentença reconheceu a falha no dever de cuidado (art. 54-D do CDC) e atribuiu aos bancos a responsabilidade pelo superendividamento. A responsabilidade do fornecedor por defeito na prestação do serviço é objetiva (art. 14 do CDC), e o art. 54-D, parágrafo único, do CDC prevê expressamente a indenização por danos morais. Somam-se a isso a resistência dos bancos ao cumprimento da tutela de urgência e a cobrança, pelo Bradesco, das parcelas por débito em conta corrente, prolongando a privação da Apelante mesmo após a ordem judicial.</w:t>
+          <w:color w:val="C00000"/>
+        </w:rPr>
+        <w:t>A Apelante passou a receber R$ 1,42 por mês, durante meses,</w:t>
+      </w:r>
+      <w:r>
+        <w:rPr>
+          <w:b w:val="0"/>
+          <w:i w:val="0"/>
+        </w:rPr>
+        <w:t xml:space="preserve"> situação que esta Corte classificou como “vulnerabilidade social extrema” e que a própria sentença qualificou como “condição indigna”. O salário tem natureza alimentar e proteção constitucional (art. 7º, X, da CF) e processual (art. 833, IV, do CPC).</w:t>
+      </w:r>
+    </w:p>
+    <w:p>
+      <w:pPr>
+        <w:spacing w:after="60" w:line="360"/>
+        <w:ind w:firstLine="850"/>
+        <w:jc w:val="both"/>
+      </w:pPr>
+      <w:r>
+        <w:rPr>
+          <w:b w:val="0"/>
+          <w:i w:val="0"/>
+        </w:rPr>
+        <w:t>A privação dos meios de subsistência de uma pessoa, imposta por falha na concessão do crédito, ultrapassa em muito o aborrecimento cotidiano e atinge diretamente a dignidade da pessoa humana (art. 1º, III, da CF).</w:t>
+      </w:r>
+    </w:p>
+    <w:p>
+      <w:pPr>
+        <w:spacing w:after="60" w:line="360"/>
+        <w:ind w:firstLine="850"/>
+        <w:jc w:val="both"/>
+      </w:pPr>
+      <w:r>
+        <w:rPr>
+          <w:b w:val="0"/>
+          <w:i w:val="0"/>
+        </w:rPr>
+        <w:t>Como demonstrado, a sentença reconheceu a falha no dever de cuidado (art. 54-D do CDC) e atribuiu aos bancos a responsabilidade pelo superendividamento. A responsabilidade do fornecedor por defeito na prestação do serviço é objetiva (art. 14 do CDC), e o art. 54-D, parágrafo único, do CDC prevê expressamente a indenização por danos morais.</w:t>
+      </w:r>
+    </w:p>
+    <w:p>
+      <w:pPr>
+        <w:spacing w:after="60" w:line="360"/>
+        <w:ind w:firstLine="850"/>
+        <w:jc w:val="both"/>
+      </w:pPr>
+      <w:r>
+        <w:rPr>
+          <w:b w:val="0"/>
+          <w:i w:val="0"/>
+        </w:rPr>
+        <w:t>Somam-se a isso a resistência dos bancos ao cumprimento da tutela de urgência e a cobrança, pelo Bradesco, das parcelas por débito em conta corrente, prolongando a privação da Apelante mesmo após a ordem judicial.</w:t>
       </w:r>
     </w:p>
     <w:p>
@@ -1778,7 +1697,21 @@
           <w:b w:val="0"/>
           <w:i w:val="0"/>
         </w:rPr>
-        <w:t xml:space="preserve">Uma vez reconhecido pela própria sentença que a impossibilidade de pagamento das parcelas originais decorre da conduta dos bancos, o art. 54-D, parágrafo único, do CDC autoriza a “redução dos juros, dos encargos ou de qualquer acréscimo ao principal”. Requer-se, assim, que o saldo remanescente seja composto apenas pelas parcelas originalmente contratadas e não descontadas, atualizadas monetariamente, </w:t>
+        <w:t>Uma vez reconhecido pela própria sentença que a impossibilidade de pagamento das parcelas originais decorre da conduta dos bancos, o art. 54-D, parágrafo único, do CDC autoriza a “redução dos juros, dos encargos ou de qualquer acréscimo ao principal”.</w:t>
+      </w:r>
+    </w:p>
+    <w:p>
+      <w:pPr>
+        <w:spacing w:after="60" w:line="360"/>
+        <w:ind w:firstLine="850"/>
+        <w:jc w:val="both"/>
+      </w:pPr>
+      <w:r>
+        <w:rPr>
+          <w:b w:val="0"/>
+          <w:i w:val="0"/>
+        </w:rPr>
+        <w:t xml:space="preserve">Requer-se, assim, que o saldo remanescente seja composto apenas pelas parcelas originalmente contratadas e não descontadas, atualizadas monetariamente, </w:t>
       </w:r>
       <w:r>
         <w:rPr>
@@ -1930,21 +1863,22 @@
           <w:b w:val="0"/>
           <w:i w:val="0"/>
         </w:rPr>
-        <w:t xml:space="preserve"> da remuneração líquida da Apelante, desde agosto de 2024 até a efetiva adequação dos descontos por cada instituição, em folha de pagamento ou em conta corrente, correspondendo o período de agosto de 2024 a fevereiro de 2025 a </w:t>
-      </w:r>
-      <w:r>
-        <w:rPr>
-          <w:b/>
-          <w:i w:val="0"/>
-        </w:rPr>
-        <w:t>R$ 34.951,98</w:t>
-      </w:r>
-      <w:r>
-        <w:rPr>
-          <w:b w:val="0"/>
-          <w:i w:val="0"/>
-        </w:rPr>
-        <w:t>, distribuídos entre os réus pelo critério cronológico (Banco do Brasil, R$ 30.500,61; Bradesco, R$ 4.451,37) ou, subsidiariamente, pelo critério proporcional (Banco do Brasil, R$ 18.714,10; Bradesco, R$ 16.237,89), e os meses posteriores apurados em liquidação de sentença, com correção monetária desde cada desconto e juros de mora desde a citação;</w:t>
+        <w:t xml:space="preserve"> da remuneração líquida da Apelante, desde agosto de 2024 até a efetiva adequação dos descontos por cada instituição, em folha de pagamento ou em conta corrente</w:t>
+      </w:r>
+      <w:r>
+        <w:rPr>
+          <w:b w:val="0"/>
+          <w:i w:val="0"/>
+          <w:color w:val="C00000"/>
+        </w:rPr>
+        <w:t>, a serem apurados em liquidação de sentença, com correção monetária desde cada desconto e juros de mora desde a citação</w:t>
+      </w:r>
+      <w:r>
+        <w:rPr>
+          <w:b w:val="0"/>
+          <w:i w:val="0"/>
+        </w:rPr>
+        <w:t>;</w:t>
       </w:r>
     </w:p>
     <w:p>
@@ -1960,24 +1894,27 @@
         <w:rPr>
           <w:b w:val="0"/>
           <w:i w:val="0"/>
+          <w:color w:val="C00000"/>
         </w:rPr>
         <w:t>B.</w:t>
         <w:tab/>
-        <w:t xml:space="preserve">subsidiariamente ao pedido “A”, determinar o </w:t>
-      </w:r>
-      <w:r>
-        <w:rPr>
-          <w:b/>
-          <w:i w:val="0"/>
-        </w:rPr>
-        <w:t>abatimento dos valores descontados em excesso do saldo devedor</w:t>
-      </w:r>
-      <w:r>
-        <w:rPr>
-          <w:b w:val="0"/>
-          <w:i w:val="0"/>
-        </w:rPr>
-        <w:t xml:space="preserve"> de cada contrato, com a redução correspondente do saldo remanescente;</w:t>
+        <w:t xml:space="preserve">subsidiariamente ao pedido “A”, condenar os Apelados, solidariamente, à restituição dos valores descontados acima do limite de 35% </w:t>
+      </w:r>
+      <w:r>
+        <w:rPr>
+          <w:b/>
+          <w:i w:val="0"/>
+          <w:color w:val="C00000"/>
+        </w:rPr>
+        <w:t>após a decisão de 02/06/2025</w:t>
+      </w:r>
+      <w:r>
+        <w:rPr>
+          <w:b w:val="0"/>
+          <w:i w:val="0"/>
+          <w:color w:val="C00000"/>
+        </w:rPr>
+        <w:t xml:space="preserve"> proferida no Agravo de Instrumento nº 0757054-31.2025.8.18.0000, até a efetiva adequação por cada instituição;</w:t>
       </w:r>
     </w:p>
     <w:p>
@@ -1993,24 +1930,27 @@
         <w:rPr>
           <w:b w:val="0"/>
           <w:i w:val="0"/>
+          <w:color w:val="C00000"/>
         </w:rPr>
         <w:t>C.</w:t>
         <w:tab/>
-        <w:t xml:space="preserve">condenar os Apelados, solidariamente, ao pagamento de </w:t>
-      </w:r>
-      <w:r>
-        <w:rPr>
-          <w:b/>
-          <w:i w:val="0"/>
-        </w:rPr>
-        <w:t>indenização por danos morais de R$ 10.000,00</w:t>
-      </w:r>
-      <w:r>
-        <w:rPr>
-          <w:b w:val="0"/>
-          <w:i w:val="0"/>
-        </w:rPr>
-        <w:t xml:space="preserve"> (dez mil reais), com correção monetária desde o arbitramento e juros de mora desde a citação;</w:t>
+        <w:t xml:space="preserve">subsidiariamente aos pedidos “A” e “B”, determinar o </w:t>
+      </w:r>
+      <w:r>
+        <w:rPr>
+          <w:b/>
+          <w:i w:val="0"/>
+          <w:color w:val="C00000"/>
+        </w:rPr>
+        <w:t>abatimento dos valores descontados em excesso do saldo devedor</w:t>
+      </w:r>
+      <w:r>
+        <w:rPr>
+          <w:b w:val="0"/>
+          <w:i w:val="0"/>
+          <w:color w:val="C00000"/>
+        </w:rPr>
+        <w:t xml:space="preserve"> de cada contrato, com a redução correspondente do saldo remanescente;</w:t>
       </w:r>
     </w:p>
     <w:p>
@@ -2026,24 +1966,31 @@
         <w:rPr>
           <w:b w:val="0"/>
           <w:i w:val="0"/>
+          <w:color w:val="C00000"/>
         </w:rPr>
         <w:t>D.</w:t>
+      </w:r>
+      <w:r>
+        <w:rPr>
+          <w:b w:val="0"/>
+          <w:i w:val="0"/>
+        </w:rPr>
         <w:tab/>
-        <w:t xml:space="preserve">determinar que o saldo remanescente seja composto apenas pelas parcelas originais não descontadas, atualizadas monetariamente, </w:t>
-      </w:r>
-      <w:r>
-        <w:rPr>
-          <w:b/>
-          <w:i w:val="0"/>
-        </w:rPr>
-        <w:t>sem incidência de novos juros remuneratórios ou capitalização</w:t>
-      </w:r>
-      <w:r>
-        <w:rPr>
-          <w:b w:val="0"/>
-          <w:i w:val="0"/>
-        </w:rPr>
-        <w:t>;</w:t>
+        <w:t xml:space="preserve">condenar os Apelados, solidariamente, ao pagamento de </w:t>
+      </w:r>
+      <w:r>
+        <w:rPr>
+          <w:b/>
+          <w:i w:val="0"/>
+        </w:rPr>
+        <w:t>indenização por danos morais de R$ 10.000,00</w:t>
+      </w:r>
+      <w:r>
+        <w:rPr>
+          <w:b w:val="0"/>
+          <w:i w:val="0"/>
+        </w:rPr>
+        <w:t xml:space="preserve"> (dez mil reais), com correção monetária desde o arbitramento e juros de mora desde a citação;</w:t>
       </w:r>
     </w:p>
     <w:p>
@@ -2059,10 +2006,31 @@
         <w:rPr>
           <w:b w:val="0"/>
           <w:i w:val="0"/>
+          <w:color w:val="C00000"/>
         </w:rPr>
         <w:t>E.</w:t>
+      </w:r>
+      <w:r>
+        <w:rPr>
+          <w:b w:val="0"/>
+          <w:i w:val="0"/>
+        </w:rPr>
         <w:tab/>
-        <w:t>atribuir aos Apelados a integralidade dos ônus de sucumbência, com honorários de 10% sobre o valor atualizado da condenação ou da causa, o que for maior, majorados nos termos do art. 85, § 11, do CPC;</w:t>
+        <w:t xml:space="preserve">determinar que o saldo remanescente seja composto apenas pelas parcelas originais não descontadas, atualizadas monetariamente, </w:t>
+      </w:r>
+      <w:r>
+        <w:rPr>
+          <w:b/>
+          <w:i w:val="0"/>
+        </w:rPr>
+        <w:t>sem incidência de novos juros remuneratórios ou capitalização</w:t>
+      </w:r>
+      <w:r>
+        <w:rPr>
+          <w:b w:val="0"/>
+          <w:i w:val="0"/>
+        </w:rPr>
+        <w:t>;</w:t>
       </w:r>
     </w:p>
     <w:p>
@@ -2078,8 +2046,41 @@
         <w:rPr>
           <w:b w:val="0"/>
           <w:i w:val="0"/>
+          <w:color w:val="C00000"/>
         </w:rPr>
         <w:t>F.</w:t>
+      </w:r>
+      <w:r>
+        <w:rPr>
+          <w:b w:val="0"/>
+          <w:i w:val="0"/>
+        </w:rPr>
+        <w:tab/>
+        <w:t>atribuir aos Apelados a integralidade dos ônus de sucumbência, com honorários de 10% sobre o valor atualizado da condenação ou da causa, o que for maior, majorados nos termos do art. 85, § 11, do CPC;</w:t>
+      </w:r>
+    </w:p>
+    <w:p>
+      <w:pPr>
+        <w:tabs>
+          <w:tab w:val="left" w:pos="1000"/>
+        </w:tabs>
+        <w:spacing w:after="60" w:line="360"/>
+        <w:ind w:left="1000" w:hanging="400"/>
+        <w:jc w:val="both"/>
+      </w:pPr>
+      <w:r>
+        <w:rPr>
+          <w:b w:val="0"/>
+          <w:i w:val="0"/>
+          <w:color w:val="C00000"/>
+        </w:rPr>
+        <w:t>G.</w:t>
+      </w:r>
+      <w:r>
+        <w:rPr>
+          <w:b w:val="0"/>
+          <w:i w:val="0"/>
+        </w:rPr>
         <w:tab/>
         <w:t>pronunciar-se expressamente sobre os dispositivos indicados no tópico do prequestionamento.</w:t>
       </w:r>

</xml_diff>